<commit_message>
poprawka w sprawozdaniu punkt 4.1
</commit_message>
<xml_diff>
--- a/SPRAWOZDANIE/Sprawozdanie.docx
+++ b/SPRAWOZDANIE/Sprawozdanie.docx
@@ -97,13 +97,7 @@
               <w:rPr>
                 <w:lang w:val="pl-PL"/>
               </w:rPr>
-              <w:t>II rok, IV semest</w:t>
-            </w:r>
-            <w:r>
-              <w:rPr>
-                <w:lang w:val="pl-PL"/>
-              </w:rPr>
-              <w:t>r</w:t>
+              <w:t>II rok, IV semestr</w:t>
             </w:r>
           </w:p>
         </w:tc>
@@ -151,13 +145,7 @@
               <w:rPr>
                 <w:lang w:val="pl-PL"/>
               </w:rPr>
-              <w:t xml:space="preserve">Tytuł projektu: </w:t>
-            </w:r>
-            <w:r>
-              <w:rPr>
-                <w:lang w:val="pl-PL"/>
-              </w:rPr>
-              <w:t xml:space="preserve">System zarządzania usługami czyszczenia ciśnieniowego </w:t>
+              <w:t xml:space="preserve">Tytuł projektu: System zarządzania usługami czyszczenia ciśnieniowego </w:t>
             </w:r>
             <w:proofErr w:type="spellStart"/>
             <w:r>
@@ -2566,7 +2554,7 @@
           <w:szCs w:val="28"/>
           <w:u w:val="single"/>
         </w:rPr>
-        <w:t>4</w:t>
+        <w:t>4.1. Diagram przypadków użycia</w:t>
       </w:r>
       <w:r>
         <w:rPr>
@@ -2576,9 +2564,15 @@
           <w:szCs w:val="28"/>
           <w:u w:val="single"/>
         </w:rPr>
-        <w:t>.</w:t>
-      </w:r>
-      <w:r>
+        <w:br/>
+      </w:r>
+    </w:p>
+    <w:p>
+      <w:pPr>
+        <w:pStyle w:val="Akapitzlist"/>
+        <w:spacing w:after="120"/>
+        <w:ind w:left="555"/>
+        <w:jc w:val="center"/>
         <w:rPr>
           <w:b/>
           <w:bCs/>
@@ -2586,54 +2580,11 @@
           <w:szCs w:val="28"/>
           <w:u w:val="single"/>
         </w:rPr>
-        <w:t>1</w:t>
-      </w:r>
-      <w:r>
-        <w:rPr>
-          <w:b/>
-          <w:bCs/>
-          <w:sz w:val="28"/>
-          <w:szCs w:val="28"/>
-          <w:u w:val="single"/>
-        </w:rPr>
-        <w:t xml:space="preserve">. </w:t>
-      </w:r>
-      <w:r>
-        <w:rPr>
-          <w:b/>
-          <w:bCs/>
-          <w:sz w:val="28"/>
-          <w:szCs w:val="28"/>
-          <w:u w:val="single"/>
-        </w:rPr>
-        <w:t>Diagram przypadków użycia</w:t>
-      </w:r>
-      <w:r>
-        <w:rPr>
-          <w:b/>
-          <w:bCs/>
-          <w:sz w:val="28"/>
-          <w:szCs w:val="28"/>
-          <w:u w:val="single"/>
-        </w:rPr>
-        <w:br/>
-      </w:r>
-    </w:p>
-    <w:p>
-      <w:pPr>
-        <w:pStyle w:val="Akapitzlist"/>
-        <w:spacing w:after="120"/>
-        <w:ind w:left="555"/>
-        <w:jc w:val="center"/>
-        <w:rPr>
-          <w:b/>
-          <w:bCs/>
-          <w:sz w:val="28"/>
-          <w:szCs w:val="28"/>
-          <w:u w:val="single"/>
-        </w:rPr>
-      </w:pPr>
-      <w:r>
+      </w:pPr>
+      <w:r>
+        <w:rPr>
+          <w:noProof/>
+        </w:rPr>
         <w:drawing>
           <wp:inline distT="0" distB="0" distL="0" distR="0" wp14:anchorId="35978BBC" wp14:editId="7B09ED02">
             <wp:extent cx="4622800" cy="8607591"/>
@@ -2707,9 +2658,250 @@
           <w:u w:val="single"/>
         </w:rPr>
         <w:lastRenderedPageBreak/>
-        <w:t>4.1.</w:t>
-      </w:r>
-      <w:r>
+        <w:t>4.1.1 Opisy wszystkich aktorów:</w:t>
+      </w:r>
+    </w:p>
+    <w:p>
+      <w:pPr>
+        <w:pStyle w:val="Akapitzlist"/>
+        <w:numPr>
+          <w:ilvl w:val="0"/>
+          <w:numId w:val="18"/>
+        </w:numPr>
+        <w:spacing w:after="120"/>
+        <w:ind w:left="709"/>
+        <w:jc w:val="both"/>
+      </w:pPr>
+      <w:r>
+        <w:rPr>
+          <w:b/>
+          <w:bCs/>
+        </w:rPr>
+        <w:t>Klient</w:t>
+      </w:r>
+      <w:r>
+        <w:t xml:space="preserve"> – główny użytkownik portalu. Zgłasza chęć wyczyszczenia posesji, wgrywa zdjęcia, wybiera termin, opłaca zadatek, a po wszystkim akceptuje wykonaną pracę lub zgłasza reklamację.</w:t>
+      </w:r>
+    </w:p>
+    <w:p>
+      <w:pPr>
+        <w:pStyle w:val="Akapitzlist"/>
+        <w:numPr>
+          <w:ilvl w:val="0"/>
+          <w:numId w:val="18"/>
+        </w:numPr>
+        <w:spacing w:after="120"/>
+        <w:ind w:left="709"/>
+        <w:jc w:val="both"/>
+      </w:pPr>
+      <w:r>
+        <w:rPr>
+          <w:b/>
+          <w:bCs/>
+        </w:rPr>
+        <w:t>Operator myjki</w:t>
+      </w:r>
+      <w:r>
+        <w:t xml:space="preserve"> – pracownik terenowy. Korzysta z aplikacji na tablecie, gdzie widzi plan dnia, adresy, wskazówki dojazdu i instrukcje od klienta. Odznacza w systemie rozpoczęcie i zakończenie pracy.</w:t>
+      </w:r>
+    </w:p>
+    <w:p>
+      <w:pPr>
+        <w:pStyle w:val="Akapitzlist"/>
+        <w:numPr>
+          <w:ilvl w:val="0"/>
+          <w:numId w:val="18"/>
+        </w:numPr>
+        <w:spacing w:after="120"/>
+        <w:ind w:left="709"/>
+        <w:jc w:val="both"/>
+      </w:pPr>
+      <w:r>
+        <w:rPr>
+          <w:b/>
+          <w:bCs/>
+        </w:rPr>
+        <w:t>Administrator / Pan Zenon</w:t>
+      </w:r>
+      <w:r>
+        <w:t xml:space="preserve"> – właściciel lub osoba zarządzająca. Loguje się do panelu, aby przeglądać statystyki przychodów, oceniać wydajność ekip i kontrolować stany magazynowe Turbo-Piany.</w:t>
+      </w:r>
+    </w:p>
+    <w:p>
+      <w:pPr>
+        <w:pStyle w:val="Akapitzlist"/>
+        <w:numPr>
+          <w:ilvl w:val="0"/>
+          <w:numId w:val="18"/>
+        </w:numPr>
+        <w:spacing w:after="120"/>
+        <w:ind w:left="709"/>
+        <w:jc w:val="both"/>
+      </w:pPr>
+      <w:r>
+        <w:rPr>
+          <w:b/>
+          <w:bCs/>
+        </w:rPr>
+        <w:t>Pracownik techniczny</w:t>
+      </w:r>
+      <w:r>
+        <w:t xml:space="preserve"> – osoba odpowiedzialna za flotę. Diagnozuje stan myjek, oznacza zepsute jako wymagające naprawy i przypisuje ekipom sprzęt zastępczy, aby zachować ciągłość pracy.</w:t>
+      </w:r>
+    </w:p>
+    <w:p>
+      <w:pPr>
+        <w:pStyle w:val="Akapitzlist"/>
+        <w:numPr>
+          <w:ilvl w:val="0"/>
+          <w:numId w:val="18"/>
+        </w:numPr>
+        <w:spacing w:after="120"/>
+        <w:ind w:left="709"/>
+        <w:jc w:val="both"/>
+      </w:pPr>
+      <w:r>
+        <w:rPr>
+          <w:b/>
+          <w:bCs/>
+        </w:rPr>
+        <w:t>Dział serwisowy</w:t>
+      </w:r>
+      <w:r>
+        <w:t xml:space="preserve"> – zespół zajmujący się fizyczną naprawą zepsutych myjek. W systemie odnotowuje jedynie, że sprzęt został naprawiony i może wrócić do użytku.</w:t>
+      </w:r>
+    </w:p>
+    <w:p>
+      <w:pPr>
+        <w:pStyle w:val="Akapitzlist"/>
+        <w:numPr>
+          <w:ilvl w:val="0"/>
+          <w:numId w:val="18"/>
+        </w:numPr>
+        <w:spacing w:after="120"/>
+        <w:ind w:left="709"/>
+        <w:jc w:val="both"/>
+      </w:pPr>
+      <w:r>
+        <w:rPr>
+          <w:b/>
+          <w:bCs/>
+        </w:rPr>
+        <w:t>System (</w:t>
+      </w:r>
+      <w:proofErr w:type="spellStart"/>
+      <w:r>
+        <w:rPr>
+          <w:b/>
+          <w:bCs/>
+        </w:rPr>
+        <w:t>Timer</w:t>
+      </w:r>
+      <w:proofErr w:type="spellEnd"/>
+      <w:r>
+        <w:rPr>
+          <w:b/>
+          <w:bCs/>
+        </w:rPr>
+        <w:t>)</w:t>
+      </w:r>
+      <w:r>
+        <w:t xml:space="preserve"> – automat działający w tle. Odpowiada za pilnowanie czasu i stanów – usuwa rezerwacje nieopłacone w ciągu 20 minut i generuje zapytania ofertowe na chemię, gdy jej brakuje.</w:t>
+      </w:r>
+    </w:p>
+    <w:p>
+      <w:pPr>
+        <w:pStyle w:val="Akapitzlist"/>
+        <w:numPr>
+          <w:ilvl w:val="0"/>
+          <w:numId w:val="18"/>
+        </w:numPr>
+        <w:spacing w:after="120"/>
+        <w:ind w:left="709"/>
+        <w:jc w:val="both"/>
+      </w:pPr>
+      <w:r>
+        <w:rPr>
+          <w:b/>
+          <w:bCs/>
+        </w:rPr>
+        <w:t>Bramka płatności</w:t>
+      </w:r>
+      <w:r>
+        <w:t xml:space="preserve"> – zewnętrzny system finansowy (np. PayU, Przelewy24). Obsługuje transakcję opłacania zadatku przez klienta.</w:t>
+      </w:r>
+    </w:p>
+    <w:p>
+      <w:pPr>
+        <w:pStyle w:val="Akapitzlist"/>
+        <w:numPr>
+          <w:ilvl w:val="0"/>
+          <w:numId w:val="18"/>
+        </w:numPr>
+        <w:spacing w:after="120"/>
+        <w:ind w:left="709"/>
+        <w:jc w:val="both"/>
+      </w:pPr>
+      <w:r>
+        <w:rPr>
+          <w:b/>
+          <w:bCs/>
+        </w:rPr>
+        <w:t>Dostawca hurtowy</w:t>
+      </w:r>
+      <w:r>
+        <w:t xml:space="preserve"> – zewnętrzna hurtownia chemii czyszczącej. W systemie jest jedynie odbiorcą – otrzymuje automatyczne zapytania ofertowe, gdy poziom Turbo-Piany spadnie poniżej określonego progu.</w:t>
+      </w:r>
+    </w:p>
+    <w:p>
+      <w:pPr>
+        <w:pStyle w:val="Akapitzlist"/>
+        <w:numPr>
+          <w:ilvl w:val="0"/>
+          <w:numId w:val="18"/>
+        </w:numPr>
+        <w:spacing w:after="120"/>
+        <w:ind w:left="709"/>
+        <w:jc w:val="both"/>
+      </w:pPr>
+      <w:r>
+        <w:rPr>
+          <w:b/>
+          <w:bCs/>
+        </w:rPr>
+        <w:t xml:space="preserve">Moduł </w:t>
+      </w:r>
+      <w:proofErr w:type="spellStart"/>
+      <w:r>
+        <w:rPr>
+          <w:b/>
+          <w:bCs/>
+        </w:rPr>
+        <w:t>IoT</w:t>
+      </w:r>
+      <w:proofErr w:type="spellEnd"/>
+      <w:r>
+        <w:rPr>
+          <w:b/>
+          <w:bCs/>
+        </w:rPr>
+        <w:t xml:space="preserve"> myjki</w:t>
+      </w:r>
+      <w:r>
+        <w:t xml:space="preserve"> – sprzętowe czujniki wbudowane w maszynę. Niezależnie od człowieka monitorują temperaturę silnika i przepływ wody, a przy ryzyku awarii (np. przegrzania) automatycznie blokują urządzenie.</w:t>
+      </w:r>
+    </w:p>
+    <w:p>
+      <w:pPr>
+        <w:spacing w:after="120"/>
+      </w:pPr>
+    </w:p>
+    <w:p>
+      <w:pPr>
+        <w:pStyle w:val="Akapitzlist"/>
+        <w:spacing w:after="120"/>
+        <w:ind w:left="555"/>
+        <w:jc w:val="both"/>
         <w:rPr>
           <w:b/>
           <w:bCs/>
@@ -2717,8 +2909,7 @@
           <w:szCs w:val="24"/>
           <w:u w:val="single"/>
         </w:rPr>
-        <w:t>1</w:t>
-      </w:r>
+      </w:pPr>
       <w:r>
         <w:rPr>
           <w:b/>
@@ -2727,368 +2918,7 @@
           <w:szCs w:val="24"/>
           <w:u w:val="single"/>
         </w:rPr>
-        <w:t xml:space="preserve"> </w:t>
-      </w:r>
-      <w:r>
-        <w:rPr>
-          <w:b/>
-          <w:bCs/>
-          <w:sz w:val="24"/>
-          <w:szCs w:val="24"/>
-          <w:u w:val="single"/>
-        </w:rPr>
-        <w:t>Opisy wszystkich aktorów:</w:t>
-      </w:r>
-    </w:p>
-    <w:p>
-      <w:pPr>
-        <w:pStyle w:val="Akapitzlist"/>
-        <w:numPr>
-          <w:ilvl w:val="0"/>
-          <w:numId w:val="18"/>
-        </w:numPr>
-        <w:spacing w:after="120"/>
-        <w:ind w:left="709"/>
-        <w:jc w:val="both"/>
-      </w:pPr>
-      <w:r>
-        <w:rPr>
-          <w:b/>
-          <w:bCs/>
-        </w:rPr>
-        <w:t>Klient</w:t>
-      </w:r>
-      <w:r>
-        <w:t xml:space="preserve"> – </w:t>
-      </w:r>
-      <w:r>
-        <w:t>główny użytkownik portalu. Zgłasza chęć wyczyszczenia posesji, wgrywa zdjęcia, wybiera termin, opłaca zadatek, a po wszystkim akceptuje wykonaną pracę lub zgłasza reklamację.</w:t>
-      </w:r>
-    </w:p>
-    <w:p>
-      <w:pPr>
-        <w:pStyle w:val="Akapitzlist"/>
-        <w:numPr>
-          <w:ilvl w:val="0"/>
-          <w:numId w:val="18"/>
-        </w:numPr>
-        <w:spacing w:after="120"/>
-        <w:ind w:left="709"/>
-        <w:jc w:val="both"/>
-      </w:pPr>
-      <w:r>
-        <w:rPr>
-          <w:b/>
-          <w:bCs/>
-        </w:rPr>
-        <w:t>Operator myjki</w:t>
-      </w:r>
-      <w:r>
-        <w:t xml:space="preserve"> </w:t>
-      </w:r>
-      <w:r>
-        <w:t xml:space="preserve">– </w:t>
-      </w:r>
-      <w:r>
-        <w:t>pracownik terenowy. Korzysta z aplikacji na tablecie, gdzie widzi plan dnia, adresy, wskazówki dojazdu i instrukcje od klienta. Odznacza w systemie rozpoczęcie i zakończenie pracy.</w:t>
-      </w:r>
-    </w:p>
-    <w:p>
-      <w:pPr>
-        <w:pStyle w:val="Akapitzlist"/>
-        <w:numPr>
-          <w:ilvl w:val="0"/>
-          <w:numId w:val="18"/>
-        </w:numPr>
-        <w:spacing w:after="120"/>
-        <w:ind w:left="709"/>
-        <w:jc w:val="both"/>
-      </w:pPr>
-      <w:r>
-        <w:rPr>
-          <w:b/>
-          <w:bCs/>
-        </w:rPr>
-        <w:t>Administrator / Pan Zenon</w:t>
-      </w:r>
-      <w:r>
-        <w:t xml:space="preserve"> – </w:t>
-      </w:r>
-      <w:r>
-        <w:t>właściciel lub osoba zarządzająca. Loguje się do panelu, aby przeglądać statystyki przychodów, oceniać wydajność ekip i kontrolować stany magazynowe Turbo-Piany.</w:t>
-      </w:r>
-    </w:p>
-    <w:p>
-      <w:pPr>
-        <w:pStyle w:val="Akapitzlist"/>
-        <w:numPr>
-          <w:ilvl w:val="0"/>
-          <w:numId w:val="18"/>
-        </w:numPr>
-        <w:spacing w:after="120"/>
-        <w:ind w:left="709"/>
-        <w:jc w:val="both"/>
-      </w:pPr>
-      <w:r>
-        <w:rPr>
-          <w:b/>
-          <w:bCs/>
-        </w:rPr>
-        <w:t>Pracownik techniczny</w:t>
-      </w:r>
-      <w:r>
-        <w:t xml:space="preserve"> – </w:t>
-      </w:r>
-      <w:r>
-        <w:t>osoba odpowiedzialna za flotę. Diagnozuje stan myjek, oznacza zepsute jako wymagające naprawy i przypisuje ekipom sprzęt zastępczy, aby zachować ciągłość pracy.</w:t>
-      </w:r>
-    </w:p>
-    <w:p>
-      <w:pPr>
-        <w:pStyle w:val="Akapitzlist"/>
-        <w:numPr>
-          <w:ilvl w:val="0"/>
-          <w:numId w:val="18"/>
-        </w:numPr>
-        <w:spacing w:after="120"/>
-        <w:ind w:left="709"/>
-        <w:jc w:val="both"/>
-      </w:pPr>
-      <w:r>
-        <w:rPr>
-          <w:b/>
-          <w:bCs/>
-        </w:rPr>
-        <w:t>Dział serwisowy</w:t>
-      </w:r>
-      <w:r>
-        <w:t xml:space="preserve"> </w:t>
-      </w:r>
-      <w:r>
-        <w:t xml:space="preserve">– </w:t>
-      </w:r>
-      <w:r>
-        <w:t>zespół zajmujący się fizyczną naprawą zepsutych myjek. W systemie odnotowuje jedynie, że sprzęt został naprawiony i może wrócić do użytku.</w:t>
-      </w:r>
-    </w:p>
-    <w:p>
-      <w:pPr>
-        <w:pStyle w:val="Akapitzlist"/>
-        <w:numPr>
-          <w:ilvl w:val="0"/>
-          <w:numId w:val="18"/>
-        </w:numPr>
-        <w:spacing w:after="120"/>
-        <w:ind w:left="709"/>
-        <w:jc w:val="both"/>
-      </w:pPr>
-      <w:r>
-        <w:rPr>
-          <w:b/>
-          <w:bCs/>
-        </w:rPr>
-        <w:t>System (</w:t>
-      </w:r>
-      <w:proofErr w:type="spellStart"/>
-      <w:r>
-        <w:rPr>
-          <w:b/>
-          <w:bCs/>
-        </w:rPr>
-        <w:t>Timer</w:t>
-      </w:r>
-      <w:proofErr w:type="spellEnd"/>
-      <w:r>
-        <w:rPr>
-          <w:b/>
-          <w:bCs/>
-        </w:rPr>
-        <w:t>)</w:t>
-      </w:r>
-      <w:r>
-        <w:t xml:space="preserve"> </w:t>
-      </w:r>
-      <w:r>
-        <w:t xml:space="preserve">– </w:t>
-      </w:r>
-      <w:r>
-        <w:t xml:space="preserve">automat działający w tle. Odpowiada za pilnowanie czasu i stanów </w:t>
-      </w:r>
-      <w:r>
-        <w:t xml:space="preserve">– </w:t>
-      </w:r>
-      <w:r>
-        <w:t>usuwa rezerwacje nieopłacone w ciągu 20 minut i generuje zapytania ofertowe na chemię, gdy jej brakuje.</w:t>
-      </w:r>
-    </w:p>
-    <w:p>
-      <w:pPr>
-        <w:pStyle w:val="Akapitzlist"/>
-        <w:numPr>
-          <w:ilvl w:val="0"/>
-          <w:numId w:val="18"/>
-        </w:numPr>
-        <w:spacing w:after="120"/>
-        <w:ind w:left="709"/>
-        <w:jc w:val="both"/>
-      </w:pPr>
-      <w:r>
-        <w:rPr>
-          <w:b/>
-          <w:bCs/>
-        </w:rPr>
-        <w:t>Bramka płatności</w:t>
-      </w:r>
-      <w:r>
-        <w:t xml:space="preserve"> </w:t>
-      </w:r>
-      <w:r>
-        <w:t xml:space="preserve">– </w:t>
-      </w:r>
-      <w:r>
-        <w:t>zewnętrzny system finansowy (np. PayU, Przelewy24). Obsługuje transakcję opłacania zadatku przez klienta.</w:t>
-      </w:r>
-    </w:p>
-    <w:p>
-      <w:pPr>
-        <w:pStyle w:val="Akapitzlist"/>
-        <w:numPr>
-          <w:ilvl w:val="0"/>
-          <w:numId w:val="18"/>
-        </w:numPr>
-        <w:spacing w:after="120"/>
-        <w:ind w:left="709"/>
-        <w:jc w:val="both"/>
-      </w:pPr>
-      <w:r>
-        <w:rPr>
-          <w:b/>
-          <w:bCs/>
-        </w:rPr>
-        <w:t>Dostawca hurtowy</w:t>
-      </w:r>
-      <w:r>
-        <w:t xml:space="preserve"> </w:t>
-      </w:r>
-      <w:r>
-        <w:t xml:space="preserve">– </w:t>
-      </w:r>
-      <w:r>
-        <w:t>zewnętrzna hurtownia chemii czyszczącej. W systemie jest jedynie odbiorcą – otrzymuje automatyczne zapytania ofertowe, gdy poziom Turbo-Piany spadnie poniżej określonego progu.</w:t>
-      </w:r>
-    </w:p>
-    <w:p>
-      <w:pPr>
-        <w:pStyle w:val="Akapitzlist"/>
-        <w:numPr>
-          <w:ilvl w:val="0"/>
-          <w:numId w:val="18"/>
-        </w:numPr>
-        <w:spacing w:after="120"/>
-        <w:ind w:left="709"/>
-        <w:jc w:val="both"/>
-      </w:pPr>
-      <w:r>
-        <w:rPr>
-          <w:b/>
-          <w:bCs/>
-        </w:rPr>
-        <w:t xml:space="preserve">Moduł </w:t>
-      </w:r>
-      <w:proofErr w:type="spellStart"/>
-      <w:r>
-        <w:rPr>
-          <w:b/>
-          <w:bCs/>
-        </w:rPr>
-        <w:t>IoT</w:t>
-      </w:r>
-      <w:proofErr w:type="spellEnd"/>
-      <w:r>
-        <w:rPr>
-          <w:b/>
-          <w:bCs/>
-        </w:rPr>
-        <w:t xml:space="preserve"> myjki</w:t>
-      </w:r>
-      <w:r>
-        <w:t xml:space="preserve"> </w:t>
-      </w:r>
-      <w:r>
-        <w:t xml:space="preserve">– </w:t>
-      </w:r>
-      <w:r>
-        <w:t>sprzętowe czujniki wbudowane w maszynę. Niezależnie od człowieka monitorują temperaturę silnika i przepływ wody, a przy ryzyku awarii (np. przegrzania) automatycznie blokują urządzenie.</w:t>
-      </w:r>
-    </w:p>
-    <w:p>
-      <w:pPr>
-        <w:spacing w:after="120"/>
-      </w:pPr>
-    </w:p>
-    <w:p>
-      <w:pPr>
-        <w:pStyle w:val="Akapitzlist"/>
-        <w:spacing w:after="120"/>
-        <w:ind w:left="555"/>
-        <w:jc w:val="both"/>
-        <w:rPr>
-          <w:b/>
-          <w:bCs/>
-          <w:sz w:val="24"/>
-          <w:szCs w:val="24"/>
-          <w:u w:val="single"/>
-        </w:rPr>
-      </w:pPr>
-      <w:r>
-        <w:rPr>
-          <w:b/>
-          <w:bCs/>
-          <w:sz w:val="24"/>
-          <w:szCs w:val="24"/>
-          <w:u w:val="single"/>
-        </w:rPr>
-        <w:t>4.1.</w:t>
-      </w:r>
-      <w:r>
-        <w:rPr>
-          <w:b/>
-          <w:bCs/>
-          <w:sz w:val="24"/>
-          <w:szCs w:val="24"/>
-          <w:u w:val="single"/>
-        </w:rPr>
-        <w:t>2</w:t>
-      </w:r>
-      <w:r>
-        <w:rPr>
-          <w:b/>
-          <w:bCs/>
-          <w:sz w:val="24"/>
-          <w:szCs w:val="24"/>
-          <w:u w:val="single"/>
-        </w:rPr>
-        <w:t xml:space="preserve"> </w:t>
-      </w:r>
-      <w:r>
-        <w:rPr>
-          <w:b/>
-          <w:bCs/>
-          <w:sz w:val="24"/>
-          <w:szCs w:val="24"/>
-          <w:u w:val="single"/>
-        </w:rPr>
-        <w:t>Opisy wybranych przypadków użycia</w:t>
-      </w:r>
-      <w:r>
-        <w:rPr>
-          <w:b/>
-          <w:bCs/>
-          <w:sz w:val="24"/>
-          <w:szCs w:val="24"/>
-          <w:u w:val="single"/>
-        </w:rPr>
-        <w:t>:</w:t>
+        <w:t>4.1.2 Opisy wybranych przypadków użycia:</w:t>
       </w:r>
     </w:p>
     <w:p>
@@ -3209,49 +3039,7 @@
           <w:b/>
           <w:bCs/>
         </w:rPr>
-        <w:t>Częstotliwość</w:t>
-      </w:r>
-      <w:r>
-        <w:rPr>
-          <w:b/>
-          <w:bCs/>
-        </w:rPr>
-        <w:t xml:space="preserve"> wykonania</w:t>
-      </w:r>
-      <w:r>
-        <w:rPr>
-          <w:b/>
-          <w:bCs/>
-        </w:rPr>
-        <w:t xml:space="preserve">, </w:t>
-      </w:r>
-      <w:r>
-        <w:rPr>
-          <w:b/>
-          <w:bCs/>
-        </w:rPr>
-        <w:t xml:space="preserve">przewidywane </w:t>
-      </w:r>
-      <w:r>
-        <w:rPr>
-          <w:b/>
-          <w:bCs/>
-        </w:rPr>
-        <w:t>spiętrzenia i czasy</w:t>
-      </w:r>
-      <w:r>
-        <w:rPr>
-          <w:b/>
-          <w:bCs/>
-        </w:rPr>
-        <w:t xml:space="preserve"> realizacji</w:t>
-      </w:r>
-      <w:r>
-        <w:rPr>
-          <w:b/>
-          <w:bCs/>
-        </w:rPr>
-        <w:t>:</w:t>
+        <w:t>Częstotliwość wykonania, przewidywane spiętrzenia i czasy realizacji:</w:t>
       </w:r>
     </w:p>
     <w:p>
@@ -3403,10 +3191,7 @@
         <w:t>Aktorzy:</w:t>
       </w:r>
       <w:r>
-        <w:t xml:space="preserve"> Klient</w:t>
-      </w:r>
-      <w:r>
-        <w:t>, Bramka płatności</w:t>
+        <w:t xml:space="preserve"> Klient, Bramka płatności</w:t>
       </w:r>
     </w:p>
     <w:p>
@@ -3753,13 +3538,7 @@
         <w:t>Spiętrzenia:</w:t>
       </w:r>
       <w:r>
-        <w:t xml:space="preserve"> Brak</w:t>
-      </w:r>
-      <w:r>
-        <w:t xml:space="preserve"> – </w:t>
-      </w:r>
-      <w:r>
-        <w:t>to proces wykonywany w tle przez serwer.</w:t>
+        <w:t xml:space="preserve"> Brak – to proces wykonywany w tle przez serwer.</w:t>
       </w:r>
     </w:p>
     <w:p>
@@ -3801,7 +3580,7 @@
         <w:t>Wartość po zakończeniu:</w:t>
       </w:r>
       <w:r>
-        <w:t xml:space="preserve"> Klient ma gwarancję terminu, a właściciel zabezpieczenie finansowe przed odwołaniem wizyty na ostatnią chwilę.</w:t>
+        <w:t xml:space="preserve"> Administrator oszczędza czas na ręcznym sprawdzaniu magazynu, ryzyko braku płynu spada do zera, a dostawca otrzymuje zamówienia na bieżąco.</w:t>
       </w:r>
     </w:p>
     <w:p>
@@ -3879,27 +3658,7 @@
           <w:u w:val="single"/>
         </w:rPr>
         <w:lastRenderedPageBreak/>
-        <w:t>5</w:t>
-      </w:r>
-      <w:r>
-        <w:rPr>
-          <w:b/>
-          <w:bCs/>
-          <w:sz w:val="40"/>
-          <w:szCs w:val="40"/>
-          <w:u w:val="single"/>
-        </w:rPr>
-        <w:t xml:space="preserve">. </w:t>
-      </w:r>
-      <w:r>
-        <w:rPr>
-          <w:b/>
-          <w:bCs/>
-          <w:sz w:val="40"/>
-          <w:szCs w:val="40"/>
-          <w:u w:val="single"/>
-        </w:rPr>
-        <w:t>Perspektywa projektowa</w:t>
+        <w:t>5. Perspektywa projektowa</w:t>
       </w:r>
     </w:p>
     <w:p>
@@ -3929,6 +3688,9 @@
         <w:ind w:left="555"/>
       </w:pPr>
       <w:r>
+        <w:rPr>
+          <w:noProof/>
+        </w:rPr>
         <w:drawing>
           <wp:inline distT="0" distB="0" distL="0" distR="0" wp14:anchorId="1C339F58" wp14:editId="0374C325">
             <wp:extent cx="5760720" cy="3647992"/>
@@ -3973,6 +3735,9 @@
         <w:ind w:left="555"/>
       </w:pPr>
       <w:r>
+        <w:rPr>
+          <w:noProof/>
+        </w:rPr>
         <w:drawing>
           <wp:inline distT="0" distB="0" distL="0" distR="0" wp14:anchorId="316F238E" wp14:editId="0FB3D282">
             <wp:extent cx="5760720" cy="3647992"/>
@@ -4017,6 +3782,9 @@
         <w:ind w:left="555"/>
       </w:pPr>
       <w:r>
+        <w:rPr>
+          <w:noProof/>
+        </w:rPr>
         <w:lastRenderedPageBreak/>
         <w:drawing>
           <wp:inline distT="0" distB="0" distL="0" distR="0" wp14:anchorId="009F897E" wp14:editId="036A4619">
@@ -4062,6 +3830,9 @@
         <w:ind w:left="555"/>
       </w:pPr>
       <w:r>
+        <w:rPr>
+          <w:noProof/>
+        </w:rPr>
         <w:drawing>
           <wp:inline distT="0" distB="0" distL="0" distR="0" wp14:anchorId="1F0FDDB7" wp14:editId="3EB97008">
             <wp:extent cx="5760720" cy="3647992"/>
@@ -4106,6 +3877,9 @@
         <w:ind w:left="555"/>
       </w:pPr>
       <w:r>
+        <w:rPr>
+          <w:noProof/>
+        </w:rPr>
         <w:lastRenderedPageBreak/>
         <w:drawing>
           <wp:inline distT="0" distB="0" distL="0" distR="0" wp14:anchorId="050F18F6" wp14:editId="4EF6C476">

</xml_diff>